<commit_message>
feat: expand people operations and scheduling
</commit_message>
<xml_diff>
--- a/docs/modelos-documentos/admissionais/06-vale-transporte-solicitacao-v3.docx
+++ b/docs/modelos-documentos/admissionais/06-vale-transporte-solicitacao-v3.docx
@@ -1,112 +1,336 @@
 
 <file path=word/document.xml><?xml version="1.0" encoding="utf-8"?>
-<w:document xmlns:wpc="http://schemas.microsoft.com/office/word/2010/wordprocessingCanvas" xmlns:mc="http://schemas.openxmlformats.org/markup-compatibility/2006" xmlns:o="urn:schemas-microsoft-com:office:office" xmlns:r="http://schemas.openxmlformats.org/officeDocument/2006/relationships" xmlns:m="http://schemas.openxmlformats.org/officeDocument/2006/math" xmlns:v="urn:schemas-microsoft-com:vml" xmlns:wp14="http://schemas.microsoft.com/office/word/2010/wordprocessingDrawing" xmlns:wp="http://schemas.openxmlformats.org/drawingml/2006/wordprocessingDrawing" xmlns:w10="urn:schemas-microsoft-com:office:word" xmlns:w="http://schemas.openxmlformats.org/wordprocessingml/2006/main" xmlns:w14="http://schemas.microsoft.com/office/word/2010/wordml" xmlns:w15="http://schemas.microsoft.com/office/word/2012/wordml" xmlns:wpg="http://schemas.microsoft.com/office/word/2010/wordprocessingGroup" xmlns:wpi="http://schemas.microsoft.com/office/word/2010/wordprocessingInk" xmlns:wne="http://schemas.microsoft.com/office/word/2006/wordml" xmlns:wps="http://schemas.microsoft.com/office/word/2010/wordprocessingShape" xmlns:cx="http://schemas.microsoft.com/office/drawing/2014/chartex" xmlns:cx1="http://schemas.microsoft.com/office/drawing/2015/9/8/chartex" xmlns:cx2="http://schemas.microsoft.com/office/drawing/2015/10/21/chartex" xmlns:cx3="http://schemas.microsoft.com/office/drawing/2016/5/9/chartex" xmlns:cx4="http://schemas.microsoft.com/office/drawing/2016/5/10/chartex" xmlns:cx5="http://schemas.microsoft.com/office/drawing/2016/5/11/chartex" xmlns:cx6="http://schemas.microsoft.com/office/drawing/2016/5/12/chartex" xmlns:cx7="http://schemas.microsoft.com/office/drawing/2016/5/13/chartex" xmlns:cx8="http://schemas.microsoft.com/office/drawing/2016/5/14/chartex" xmlns:aink="http://schemas.microsoft.com/office/drawing/2016/ink" xmlns:am3d="http://schemas.microsoft.com/office/drawing/2017/model3d" xmlns:w16cex="http://schemas.microsoft.com/office/word/2018/wordml/cex" xmlns:w16cid="http://schemas.microsoft.com/office/word/2016/wordml/cid" xmlns:w16="http://schemas.microsoft.com/office/word/2018/wordml" xmlns:w16sdtdh="http://schemas.microsoft.com/office/word/2020/wordml/sdtdatahash" xmlns:w16se="http://schemas.microsoft.com/office/word/2015/wordml/symex" mc:Ignorable="w14 w15 wp14">
+<w:document xmlns:ns1="http://schemas.openxmlformats.org/markup-compatibility/2006" xmlns:ns2="http://schemas.openxmlformats.org/officeDocument/2006/relationships" xmlns:w="http://schemas.openxmlformats.org/wordprocessingml/2006/main" ns1:Ignorable="w14 w15 wp14">
   <w:body>
     <w:p>
       <w:pPr>
-        <w:pStyle w:val="CTTituloDocumento"/>
-      </w:pPr>
-      <w:r>
+        <w:spacing w:after="300" w:before="0"/>
+        <w:jc w:val="center"/>
+      </w:pPr>
+      <w:r>
+        <w:rPr>
+          <w:rFonts w:ascii="Calibri" w:cs="Calibri" w:eastAsia="Calibri" w:hAnsi="Calibri"/>
+          <w:b/>
+          <w:bCs/>
+          <w:sz w:val="36"/>
+          <w:szCs w:val="36"/>
+        </w:rPr>
         <w:t xml:space="preserve">SOLICITAÇÃO DE VALE-TRANSPORTE</w:t>
       </w:r>
     </w:p>
     <w:p>
       <w:pPr>
-        <w:pStyle w:val="CTPreambulo"/>
-      </w:pPr>
-    </w:p>
-    <w:p>
-      <w:pPr>
-        <w:pStyle w:val="CTPreambulo"/>
-      </w:pPr>
-      <w:r>
-        <w:t xml:space="preserve">Eu, {{employee.name}}, portador(a) da CTPS n˚ {{employee.ctps_number}} e série n˚ {{employee.ctps_series}}, doravante designado(a) como EMPREGADO(A), nos termos do artigo 7º do Decreto n˚ 95.247, de 17 de novembro de 1987, declaro que {{transport_voucher_decision_text}} pela utilização do Vale-Transporte para o deslocamento residência–trabalho e vice-versa.</w:t>
-      </w:r>
-    </w:p>
-    <w:p>
-      <w:pPr>
-        <w:pStyle w:val="CTPreambulo"/>
-      </w:pPr>
-      <w:r>
-        <w:t xml:space="preserve">Informações para a concessão do benefício, nos termos do artigo 7º do Decreto n˚ 95.247/87:</w:t>
-      </w:r>
-    </w:p>
-    <w:p>
-      <w:pPr>
-        <w:pStyle w:val="CTPreambulo"/>
-      </w:pPr>
-      <w:r>
+        <w:pBdr>
+          <w:bottom w:val="single" w:color="999999" w:sz="6"/>
+        </w:pBdr>
+        <w:spacing w:after="300" w:before="0"/>
+      </w:pPr>
+      <w:r>
+        <w:t xml:space="preserve"/>
+      </w:r>
+    </w:p>
+    <w:p>
+      <w:pPr>
+        <w:spacing w:after="180" w:before="0" w:line="320"/>
+        <w:jc w:val="both"/>
+      </w:pPr>
+      <w:r>
+        <w:rPr>
+          <w:rFonts w:ascii="Calibri" w:cs="Calibri" w:eastAsia="Calibri" w:hAnsi="Calibri"/>
+          <w:sz w:val="22"/>
+          <w:szCs w:val="22"/>
+        </w:rPr>
+        <w:t xml:space="preserve">Eu, {{employee.name}}, portador(a) da CTPS n˚ {{employee.ctps_number}} e série n˚ {{employee.ctps_series}}, doravante designado(a) como EMPREGADO(A), declaro que {{transport_voucher_decision_text}} pela utilização do vale-transporte para o deslocamento residência–trabalho e vice-versa.</w:t>
+      </w:r>
+      <w:r>
+        <w:rPr>
+          <w:rFonts w:ascii="Calibri" w:cs="Calibri" w:eastAsia="Calibri" w:hAnsi="Calibri"/>
+          <w:b/>
+          <w:bCs/>
+          <w:sz w:val="22"/>
+          <w:szCs w:val="22"/>
+        </w:rPr>
+        <w:t xml:space="preserve"/>
+      </w:r>
+      <w:r>
+        <w:rPr>
+          <w:rFonts w:ascii="Calibri" w:cs="Calibri" w:eastAsia="Calibri" w:hAnsi="Calibri"/>
+          <w:sz w:val="22"/>
+          <w:szCs w:val="22"/>
+        </w:rPr>
+        <w:t xml:space="preserve"/>
+      </w:r>
+      <w:r>
+        <w:rPr>
+          <w:rFonts w:ascii="Calibri" w:cs="Calibri" w:eastAsia="Calibri" w:hAnsi="Calibri"/>
+          <w:b/>
+          <w:bCs/>
+          <w:sz w:val="22"/>
+          <w:szCs w:val="22"/>
+        </w:rPr>
+        <w:t xml:space="preserve"/>
+      </w:r>
+      <w:r>
+        <w:rPr>
+          <w:rFonts w:ascii="Calibri" w:cs="Calibri" w:eastAsia="Calibri" w:hAnsi="Calibri"/>
+          <w:sz w:val="22"/>
+          <w:szCs w:val="22"/>
+        </w:rPr>
+        <w:t xml:space="preserve"/>
+      </w:r>
+      <w:r>
+        <w:rPr>
+          <w:rFonts w:ascii="Calibri" w:cs="Calibri" w:eastAsia="Calibri" w:hAnsi="Calibri"/>
+          <w:b/>
+          <w:bCs/>
+          <w:sz w:val="22"/>
+          <w:szCs w:val="22"/>
+        </w:rPr>
+        <w:t xml:space="preserve"/>
+      </w:r>
+      <w:r>
+        <w:rPr>
+          <w:rFonts w:ascii="Calibri" w:cs="Calibri" w:eastAsia="Calibri" w:hAnsi="Calibri"/>
+          <w:sz w:val="22"/>
+          <w:szCs w:val="22"/>
+        </w:rPr>
+        <w:t xml:space="preserve"/>
+      </w:r>
+    </w:p>
+    <w:p>
+      <w:pPr>
+        <w:spacing w:after="180" w:before="0" w:line="320"/>
+        <w:jc w:val="both"/>
+      </w:pPr>
+      <w:r>
+        <w:rPr>
+          <w:rFonts w:ascii="Calibri" w:cs="Calibri" w:eastAsia="Calibri" w:hAnsi="Calibri"/>
+          <w:b/>
+          <w:bCs/>
+          <w:sz w:val="22"/>
+          <w:szCs w:val="22"/>
+        </w:rPr>
+        <w:t xml:space="preserve">Informações para a concessão do benefício:</w:t>
+      </w:r>
+    </w:p>
+    <w:p>
+      <w:pPr>
+        <w:pStyle w:val="ListParagraph"/>
+        <w:numPr>
+          <w:ilvl w:val="0"/>
+          <w:numId w:val="1"/>
+        </w:numPr>
+        <w:spacing w:after="60" w:before="60" w:line="320"/>
+        <w:jc w:val="both"/>
+      </w:pPr>
+      <w:r>
+        <w:rPr>
+          <w:rFonts w:ascii="Calibri" w:cs="Calibri" w:eastAsia="Calibri" w:hAnsi="Calibri"/>
+          <w:b/>
+          <w:bCs/>
+          <w:sz w:val="22"/>
+          <w:szCs w:val="22"/>
+        </w:rPr>
         <w:t xml:space="preserve">Endereço residencial: {{employee.address}}</w:t>
       </w:r>
     </w:p>
     <w:p>
       <w:pPr>
-        <w:pStyle w:val="CTPreambulo"/>
-      </w:pPr>
-      <w:r>
+        <w:pStyle w:val="ListParagraph"/>
+        <w:numPr>
+          <w:ilvl w:val="0"/>
+          <w:numId w:val="1"/>
+        </w:numPr>
+        <w:spacing w:after="60" w:before="60" w:line="320"/>
+        <w:jc w:val="both"/>
+      </w:pPr>
+      <w:r>
+        <w:rPr>
+          <w:rFonts w:ascii="Calibri" w:cs="Calibri" w:eastAsia="Calibri" w:hAnsi="Calibri"/>
+          <w:b/>
+          <w:bCs/>
+          <w:sz w:val="22"/>
+          <w:szCs w:val="22"/>
+        </w:rPr>
         <w:t xml:space="preserve">Quantidade de passagens por dia trabalhado: 2 (duas), correspondentes ao deslocamento de ida (residência–trabalho) e de volta (trabalho–residência).</w:t>
       </w:r>
     </w:p>
     <w:p>
       <w:pPr>
-        <w:pStyle w:val="CTPreambulo"/>
-      </w:pPr>
-      <w:r>
+        <w:pStyle w:val="ListParagraph"/>
+        <w:numPr>
+          <w:ilvl w:val="0"/>
+          <w:numId w:val="1"/>
+        </w:numPr>
+        <w:spacing w:after="60" w:before="60" w:line="320"/>
+        <w:jc w:val="both"/>
+      </w:pPr>
+      <w:r>
+        <w:rPr>
+          <w:rFonts w:ascii="Calibri" w:cs="Calibri" w:eastAsia="Calibri" w:hAnsi="Calibri"/>
+          <w:b/>
+          <w:bCs/>
+          <w:sz w:val="22"/>
+          <w:szCs w:val="22"/>
+        </w:rPr>
         <w:t xml:space="preserve">O benefício será concedido com base na tarifa vigente do transporte público coletivo do município à época de cada concessão, ficando eventuais reajustes tarifários automaticamente incorporados, independentemente de aditamento ou de nova solicitação.</w:t>
       </w:r>
     </w:p>
     <w:p>
       <w:pPr>
-        <w:pStyle w:val="CTPreambulo"/>
-      </w:pPr>
-      <w:r>
-        <w:t xml:space="preserve">Em caso de opção pelo benefício, também me comprometo a:</w:t>
-      </w:r>
-    </w:p>
-    <w:p>
-      <w:pPr>
-        <w:pStyle w:val="CTPreambulo"/>
-      </w:pPr>
-      <w:r>
+        <w:pStyle w:val="ListParagraph"/>
+        <w:numPr>
+          <w:ilvl w:val="0"/>
+          <w:numId w:val="1"/>
+        </w:numPr>
+        <w:spacing w:after="60" w:before="60" w:line="320"/>
+        <w:jc w:val="both"/>
+      </w:pPr>
+      <w:r>
+        <w:rPr>
+          <w:rFonts w:ascii="Calibri" w:cs="Calibri" w:eastAsia="Calibri" w:hAnsi="Calibri"/>
+          <w:sz w:val="22"/>
+          <w:szCs w:val="22"/>
+        </w:rPr>
         <w:t xml:space="preserve">Utilizá-lo exclusivamente para meu efetivo deslocamento residência–trabalho e vice-versa;</w:t>
       </w:r>
     </w:p>
     <w:p>
       <w:pPr>
-        <w:pStyle w:val="CTPreambulo"/>
-      </w:pPr>
-      <w:r>
-        <w:t xml:space="preserve">Renovar as informações acima anualmente ou sempre que ocorrer alteração no meu endereço residencial ou dos serviços e meios de transporte mais adequados ao meu deslocamento residência–trabalho e vice-versa;</w:t>
-      </w:r>
-    </w:p>
-    <w:p>
-      <w:pPr>
-        <w:pStyle w:val="CTPreambulo"/>
-      </w:pPr>
-      <w:r>
-        <w:t xml:space="preserve">Autorizar o desconto de até 6% (seis por cento) do meu salário básico mensal para contribuir no custeio do Vale-Transporte, conforme o artigo 9º do Decreto n˚ 95.247/87;</w:t>
-      </w:r>
-    </w:p>
-    <w:p>
-      <w:pPr>
-        <w:pStyle w:val="CTPreambulo"/>
-      </w:pPr>
-      <w:r>
-        <w:t xml:space="preserve">Declarar ciência de que a declaração falsa ou o uso indevido do Vale-Transporte constituem falta grave, conforme o §3º do artigo 7º do Decreto n˚ 95.247/87.</w:t>
-      </w:r>
-    </w:p>
-    <w:p>
-      <w:pPr>
-        <w:pStyle w:val="CTPreambulo"/>
-      </w:pPr>
-      <w:r>
+        <w:pStyle w:val="ListParagraph"/>
+        <w:numPr>
+          <w:ilvl w:val="0"/>
+          <w:numId w:val="1"/>
+        </w:numPr>
+        <w:spacing w:after="60" w:before="60" w:line="320"/>
+        <w:jc w:val="both"/>
+      </w:pPr>
+      <w:r>
+        <w:rPr>
+          <w:rFonts w:ascii="Calibri" w:cs="Calibri" w:eastAsia="Calibri" w:hAnsi="Calibri"/>
+          <w:sz w:val="22"/>
+          <w:szCs w:val="22"/>
+        </w:rPr>
+        <w:t xml:space="preserve">Renovar </w:t>
+      </w:r>
+      <w:r>
+        <w:rPr>
+          <w:rFonts w:ascii="Calibri" w:cs="Calibri" w:eastAsia="Calibri" w:hAnsi="Calibri"/>
+          <w:b/>
+          <w:bCs/>
+          <w:sz w:val="22"/>
+          <w:szCs w:val="22"/>
+        </w:rPr>
+        <w:t xml:space="preserve">as informações acima</w:t>
+      </w:r>
+      <w:r>
+        <w:rPr>
+          <w:rFonts w:ascii="Calibri" w:cs="Calibri" w:eastAsia="Calibri" w:hAnsi="Calibri"/>
+          <w:sz w:val="22"/>
+          <w:szCs w:val="22"/>
+        </w:rPr>
+        <w:t xml:space="preserve"> anualmente ou sempre que ocorrer alteração no meu endereço residencial ou dos serviços e meios de transporte mais adequados ao meu deslocamento residência–trabalho e vice-versa;</w:t>
+      </w:r>
+    </w:p>
+    <w:p>
+      <w:pPr>
+        <w:pStyle w:val="ListParagraph"/>
+        <w:numPr>
+          <w:ilvl w:val="0"/>
+          <w:numId w:val="1"/>
+        </w:numPr>
+        <w:spacing w:after="60" w:before="60" w:line="320"/>
+        <w:jc w:val="both"/>
+      </w:pPr>
+      <w:r>
+        <w:rPr>
+          <w:rFonts w:ascii="Calibri" w:cs="Calibri" w:eastAsia="Calibri" w:hAnsi="Calibri"/>
+          <w:b/>
+          <w:bCs/>
+          <w:sz w:val="22"/>
+          <w:szCs w:val="22"/>
+        </w:rPr>
+        <w:t xml:space="preserve">Autorizar o desconto</w:t>
+      </w:r>
+      <w:r>
+        <w:rPr>
+          <w:rFonts w:ascii="Calibri" w:cs="Calibri" w:eastAsia="Calibri" w:hAnsi="Calibri"/>
+          <w:sz w:val="22"/>
+          <w:szCs w:val="22"/>
+        </w:rPr>
+        <w:t xml:space="preserve"> de até 6% (seis por cento) do meu salário básico mensal para contribuir no custeio do vale-transporte, conforme o artigo 9º do Decreto n˚ 95.247/87;</w:t>
+      </w:r>
+    </w:p>
+    <w:p>
+      <w:pPr>
+        <w:pStyle w:val="ListParagraph"/>
+        <w:numPr>
+          <w:ilvl w:val="0"/>
+          <w:numId w:val="1"/>
+        </w:numPr>
+        <w:spacing w:after="60" w:before="60" w:line="320"/>
+        <w:jc w:val="both"/>
+      </w:pPr>
+      <w:r>
+        <w:rPr>
+          <w:rFonts w:ascii="Calibri" w:cs="Calibri" w:eastAsia="Calibri" w:hAnsi="Calibri"/>
+          <w:b/>
+          <w:bCs/>
+          <w:sz w:val="22"/>
+          <w:szCs w:val="22"/>
+        </w:rPr>
+        <w:t xml:space="preserve">Declarar ciência</w:t>
+      </w:r>
+      <w:r>
+        <w:rPr>
+          <w:rFonts w:ascii="Calibri" w:cs="Calibri" w:eastAsia="Calibri" w:hAnsi="Calibri"/>
+          <w:sz w:val="22"/>
+          <w:szCs w:val="22"/>
+        </w:rPr>
+        <w:t xml:space="preserve"> de que a declaração falsa ou o uso indevido do vale-transporte constituem falta grave, conforme o </w:t>
+      </w:r>
+      <w:r>
+        <w:rPr>
+          <w:rFonts w:ascii="Calibri" w:cs="Calibri" w:eastAsia="Calibri" w:hAnsi="Calibri"/>
+          <w:b/>
+          <w:bCs/>
+          <w:sz w:val="22"/>
+          <w:szCs w:val="22"/>
+        </w:rPr>
+        <w:t xml:space="preserve">§3º</w:t>
+      </w:r>
+      <w:r>
+        <w:rPr>
+          <w:rFonts w:ascii="Calibri" w:cs="Calibri" w:eastAsia="Calibri" w:hAnsi="Calibri"/>
+          <w:sz w:val="22"/>
+          <w:szCs w:val="22"/>
+        </w:rPr>
+        <w:t xml:space="preserve"> do artigo 7º do Decreto n˚ 95.247/87.</w:t>
+      </w:r>
+    </w:p>
+    <w:p>
+      <w:pPr>
+        <w:spacing w:after="180" w:before="0" w:line="320"/>
+        <w:jc w:val="both"/>
+      </w:pPr>
+      <w:r>
+        <w:rPr>
+          <w:rFonts w:ascii="Calibri" w:cs="Calibri" w:eastAsia="Calibri" w:hAnsi="Calibri"/>
+          <w:b/>
+          <w:bCs/>
+          <w:sz w:val="22"/>
+          <w:szCs w:val="22"/>
+        </w:rPr>
         <w:t xml:space="preserve">Em caso de não opção, declaro estar ciente de que o benefício não me será concedido por minha própria escolha e de que poderei requerê-lo a qualquer tempo, mediante nova solicitação acompanhada das informações exigidas.</w:t>
       </w:r>
     </w:p>
     <w:p>
       <w:pPr>
-        <w:pStyle w:val="CTPreambulo"/>
-      </w:pPr>
+        <w:spacing w:after="200" w:before="400"/>
+      </w:pPr>
+      <w:r>
+        <w:t xml:space="preserve"/>
+      </w:r>
     </w:p>
     <w:tbl>
       <w:tblPr>
@@ -142,27 +366,48 @@
           </w:tcPr>
           <w:p>
             <w:pPr>
-              <w:pStyle w:val="CTPreambulo"/>
+              <w:pBdr>
+                <w:bottom w:val="single" w:color="000000" w:sz="6"/>
+              </w:pBdr>
+              <w:spacing w:after="0" w:before="0"/>
+              <w:jc w:val="center"/>
             </w:pPr>
+            <w:r>
+              <w:rPr>
+                <w:rFonts w:ascii="Calibri" w:cs="Calibri" w:eastAsia="Calibri" w:hAnsi="Calibri"/>
+                <w:sz w:val="22"/>
+                <w:szCs w:val="22"/>
+              </w:rPr>
+              <w:t xml:space="preserve"/>
+            </w:r>
           </w:p>
           <w:p>
             <w:pPr>
-              <w:pStyle w:val="CTAssinaturaLinha"/>
+              <w:spacing w:after="0" w:before="80"/>
+              <w:jc w:val="center"/>
             </w:pPr>
             <w:r>
               <w:rPr>
-                <w:rStyle w:val="CTAssinaturaNome"/>
+                <w:rFonts w:ascii="Calibri" w:cs="Calibri" w:eastAsia="Calibri" w:hAnsi="Calibri"/>
+                <w:b/>
+                <w:bCs/>
+                <w:sz w:val="22"/>
+                <w:szCs w:val="22"/>
               </w:rPr>
               <w:t xml:space="preserve">{{employee.name}}</w:t>
             </w:r>
           </w:p>
           <w:p>
             <w:pPr>
-              <w:pStyle w:val="CTAssinatura"/>
+              <w:spacing w:after="0" w:before="0"/>
+              <w:jc w:val="center"/>
             </w:pPr>
             <w:r>
               <w:rPr>
-                <w:rStyle w:val="CTAssinaturaQualificacao"/>
+                <w:rFonts w:ascii="Calibri" w:cs="Calibri" w:eastAsia="Calibri" w:hAnsi="Calibri"/>
+                <w:color w:val="666666"/>
+                <w:sz w:val="18"/>
+                <w:szCs w:val="18"/>
               </w:rPr>
               <w:t xml:space="preserve">EMPREGADO(A)</w:t>
             </w:r>
@@ -179,9 +424,9 @@
             </w:tcBorders>
           </w:tcPr>
           <w:p>
-            <w:pPr>
-              <w:pStyle w:val="CTPreambulo"/>
-            </w:pPr>
+            <w:r>
+              <w:t xml:space="preserve"/>
+            </w:r>
           </w:p>
         </w:tc>
         <w:tc>
@@ -197,27 +442,48 @@
           </w:tcPr>
           <w:p>
             <w:pPr>
-              <w:pStyle w:val="CTPreambulo"/>
+              <w:pBdr>
+                <w:bottom w:val="single" w:color="000000" w:sz="6"/>
+              </w:pBdr>
+              <w:spacing w:after="0" w:before="0"/>
+              <w:jc w:val="center"/>
             </w:pPr>
+            <w:r>
+              <w:rPr>
+                <w:rFonts w:ascii="Calibri" w:cs="Calibri" w:eastAsia="Calibri" w:hAnsi="Calibri"/>
+                <w:sz w:val="22"/>
+                <w:szCs w:val="22"/>
+              </w:rPr>
+              <w:t xml:space="preserve"/>
+            </w:r>
           </w:p>
           <w:p>
             <w:pPr>
-              <w:pStyle w:val="CTAssinaturaLinha"/>
+              <w:spacing w:after="0" w:before="80"/>
+              <w:jc w:val="center"/>
             </w:pPr>
             <w:r>
               <w:rPr>
-                <w:rStyle w:val="CTAssinaturaNome"/>
+                <w:rFonts w:ascii="Calibri" w:cs="Calibri" w:eastAsia="Calibri" w:hAnsi="Calibri"/>
+                <w:b/>
+                <w:bCs/>
+                <w:sz w:val="22"/>
+                <w:szCs w:val="22"/>
               </w:rPr>
               <w:t xml:space="preserve">{{integration.employer_name}}</w:t>
             </w:r>
           </w:p>
           <w:p>
             <w:pPr>
-              <w:pStyle w:val="CTAssinatura"/>
+              <w:spacing w:after="0" w:before="0"/>
+              <w:jc w:val="center"/>
             </w:pPr>
             <w:r>
               <w:rPr>
-                <w:rStyle w:val="CTAssinaturaQualificacao"/>
+                <w:rFonts w:ascii="Calibri" w:cs="Calibri" w:eastAsia="Calibri" w:hAnsi="Calibri"/>
+                <w:color w:val="666666"/>
+                <w:sz w:val="18"/>
+                <w:szCs w:val="18"/>
               </w:rPr>
               <w:t xml:space="preserve">EMPREGADORA</w:t>
             </w:r>
@@ -226,10 +492,10 @@
       </w:tr>
     </w:tbl>
     <w:sectPr>
-      <w:headerReference w:type="default" r:id="rId7"/>
-      <w:footerReference w:type="default" r:id="rId8"/>
-      <w:pgSz w:w="11906" w:h="16838"/>
-      <w:pgMar w:top="1417" w:right="1701" w:bottom="1417" w:left="1701" w:header="709" w:footer="709" w:gutter="0"/>
+      <w:headerReference w:type="default" ns2:id="rId7"/>
+      <w:footerReference w:type="default" ns2:id="rId8"/>
+      <w:pgSz w:w="11906" w:h="16838" w:orient="portrait"/>
+      <w:pgMar w:top="1440" w:right="1600" w:bottom="1440" w:left="1600" w:header="708" w:footer="708" w:gutter="0"/>
       <w:pgNumType/>
       <w:docGrid w:linePitch="360"/>
     </w:sectPr>
@@ -282,8 +548,17 @@
 <w:ftr xmlns:w="http://schemas.openxmlformats.org/wordprocessingml/2006/main">
   <w:p>
     <w:pPr>
-      <w:pStyle w:val="CTRodape"/>
+      <w:jc w:val="left"/>
     </w:pPr>
+    <w:r>
+      <w:rPr>
+        <w:rFonts w:ascii="Calibri" w:cs="Calibri" w:eastAsia="Calibri" w:hAnsi="Calibri"/>
+        <w:color w:val="888888"/>
+        <w:sz w:val="16"/>
+        <w:szCs w:val="16"/>
+      </w:rPr>
+      <w:t xml:space="preserve">vale-transporte — CT Sorvetes Ltda</w:t>
+    </w:r>
   </w:p>
 </w:ftr>
 </file>
@@ -326,41 +601,52 @@
 </file>
 
 <file path=word/header1.xml><?xml version="1.0" encoding="utf-8"?>
-<w:hdr xmlns:w="http://schemas.openxmlformats.org/wordprocessingml/2006/main">
+<w:hdr xmlns:wpc="http://schemas.microsoft.com/office/word/2010/wordprocessingCanvas" xmlns:mc="http://schemas.openxmlformats.org/markup-compatibility/2006" xmlns:o="urn:schemas-microsoft-com:office:office" xmlns:r="http://schemas.openxmlformats.org/officeDocument/2006/relationships" xmlns:m="http://schemas.openxmlformats.org/officeDocument/2006/math" xmlns:v="urn:schemas-microsoft-com:vml" xmlns:wp14="http://schemas.microsoft.com/office/word/2010/wordprocessingDrawing" xmlns:wp="http://schemas.openxmlformats.org/drawingml/2006/wordprocessingDrawing" xmlns:w10="urn:schemas-microsoft-com:office:word" xmlns:w="http://schemas.openxmlformats.org/wordprocessingml/2006/main" xmlns:w14="http://schemas.microsoft.com/office/word/2010/wordml" xmlns:w15="http://schemas.microsoft.com/office/word/2012/wordml" xmlns:wpg="http://schemas.microsoft.com/office/word/2010/wordprocessingGroup" xmlns:wpi="http://schemas.microsoft.com/office/word/2010/wordprocessingInk" xmlns:wne="http://schemas.microsoft.com/office/word/2006/wordml" xmlns:wps="http://schemas.microsoft.com/office/word/2010/wordprocessingShape" xmlns:cx="http://schemas.microsoft.com/office/drawing/2014/chartex" xmlns:cx1="http://schemas.microsoft.com/office/drawing/2015/9/8/chartex" xmlns:cx2="http://schemas.microsoft.com/office/drawing/2015/10/21/chartex" xmlns:cx3="http://schemas.microsoft.com/office/drawing/2016/5/9/chartex" xmlns:cx4="http://schemas.microsoft.com/office/drawing/2016/5/10/chartex" xmlns:cx5="http://schemas.microsoft.com/office/drawing/2016/5/11/chartex" xmlns:cx6="http://schemas.microsoft.com/office/drawing/2016/5/12/chartex" xmlns:cx7="http://schemas.microsoft.com/office/drawing/2016/5/13/chartex" xmlns:cx8="http://schemas.microsoft.com/office/drawing/2016/5/14/chartex" xmlns:w16cid="http://schemas.microsoft.com/office/word/2016/wordml/cid" xmlns:w16se="http://schemas.microsoft.com/office/word/2015/wordml/symex">
   <w:p>
     <w:pPr>
-      <w:pStyle w:val="CTCabecalho"/>
+      <w:spacing w:after="0" w:before="0"/>
+      <w:jc w:val="right"/>
     </w:pPr>
     <w:r>
       <w:rPr>
-        <w:rStyle w:val="CTCabecalhoCaractere"/>
+        <w:rFonts w:ascii="Calibri" w:cs="Calibri" w:eastAsia="Calibri" w:hAnsi="Calibri"/>
+        <w:color w:val="888888"/>
+        <w:sz w:val="16"/>
+        <w:szCs w:val="16"/>
       </w:rPr>
       <w:t xml:space="preserve">Página </w:t>
     </w:r>
     <w:r>
       <w:rPr>
-        <w:rStyle w:val="CTCabecalhoCaractere"/>
+        <w:rFonts w:ascii="Calibri" w:cs="Calibri" w:eastAsia="Calibri" w:hAnsi="Calibri"/>
+        <w:color w:val="888888"/>
+        <w:sz w:val="16"/>
+        <w:szCs w:val="16"/>
       </w:rPr>
       <w:fldChar w:fldCharType="begin"/>
-      <w:instrText xml:space="preserve"> PAGE </w:instrText>
+      <w:instrText xml:space="preserve">PAGE</w:instrText>
       <w:fldChar w:fldCharType="separate"/>
-      <w:t>1</w:t>
       <w:fldChar w:fldCharType="end"/>
     </w:r>
     <w:r>
       <w:rPr>
-        <w:rStyle w:val="CTCabecalhoCaractere"/>
+        <w:rFonts w:ascii="Calibri" w:cs="Calibri" w:eastAsia="Calibri" w:hAnsi="Calibri"/>
+        <w:color w:val="888888"/>
+        <w:sz w:val="16"/>
+        <w:szCs w:val="16"/>
       </w:rPr>
       <w:t xml:space="preserve"> de </w:t>
     </w:r>
     <w:r>
       <w:rPr>
-        <w:rStyle w:val="CTCabecalhoCaractere"/>
+        <w:rFonts w:ascii="Calibri" w:cs="Calibri" w:eastAsia="Calibri" w:hAnsi="Calibri"/>
+        <w:color w:val="888888"/>
+        <w:sz w:val="16"/>
+        <w:szCs w:val="16"/>
       </w:rPr>
       <w:fldChar w:fldCharType="begin"/>
-      <w:instrText xml:space="preserve"> NUMPAGES </w:instrText>
+      <w:instrText xml:space="preserve">NUMPAGES</w:instrText>
       <w:fldChar w:fldCharType="separate"/>
-      <w:t>1</w:t>
       <w:fldChar w:fldCharType="end"/>
     </w:r>
   </w:p>
@@ -458,46 +744,6 @@
     <w:lvlOverride w:ilvl="0">
       <w:startOverride w:val="1"/>
     </w:lvlOverride>
-  </w:num>
-  <w:abstractNum w:abstractNumId="90">
-    <w:multiLevelType w:val="multilevel"/>
-    <w:lvl w:ilvl="0">
-      <w:start w:val="1"/>
-      <w:numFmt w:val="decimal"/>
-      <w:pStyle w:val="CTClausulaN1"/>
-      <w:lvlText w:val="%1."/>
-      <w:lvlJc w:val="left"/>
-      <w:pPr>
-        <w:ind w:left="425" w:hanging="425"/>
-      </w:pPr>
-      <w:rPr>
-        <w:rFonts w:ascii="Cambria" w:hAnsi="Cambria" w:eastAsia="Cambria" w:cs="Cambria"/>
-        <w:b/>
-        <w:bCs/>
-        <w:sz w:val="22"/>
-        <w:szCs w:val="22"/>
-      </w:rPr>
-    </w:lvl>
-    <w:lvl w:ilvl="1">
-      <w:start w:val="1"/>
-      <w:numFmt w:val="decimal"/>
-      <w:pStyle w:val="CTClausulaN2"/>
-      <w:lvlText w:val="%1.%2."/>
-      <w:lvlJc w:val="left"/>
-      <w:pPr>
-        <w:ind w:left="992" w:hanging="567"/>
-      </w:pPr>
-      <w:rPr>
-        <w:rFonts w:ascii="Cambria" w:hAnsi="Cambria" w:eastAsia="Cambria" w:cs="Cambria"/>
-        <w:b/>
-        <w:bCs/>
-        <w:sz w:val="22"/>
-        <w:szCs w:val="22"/>
-      </w:rPr>
-    </w:lvl>
-  </w:abstractNum>
-  <w:num w:numId="90">
-    <w:abstractNumId w:val="90"/>
   </w:num>
 </w:numbering>
 </file>
@@ -685,211 +931,5 @@
       <w:szCs w:val="20"/>
     </w:rPr>
   </w:style>
-  <w:style w:type="paragraph" w:customStyle="1" w:styleId="CTCorpo">
-    <w:name w:val="CT Corpo"/>
-    <w:basedOn w:val="Normal"/>
-    <w:next w:val="CTCorpo"/>
-    <w:qFormat/>
-    <w:pPr>
-      <w:widowControl/>
-      <w:spacing w:before="0" w:after="200" w:line="276" w:lineRule="auto"/>
-      <w:jc w:val="both"/>
-    </w:pPr>
-    <w:rPr>
-      <w:rFonts w:ascii="Cambria" w:hAnsi="Cambria" w:eastAsia="Cambria" w:cs="Cambria"/>
-      <w:sz w:val="22"/>
-      <w:szCs w:val="22"/>
-    </w:rPr>
-  </w:style>
-  <w:style w:type="paragraph" w:customStyle="1" w:styleId="CTTituloDocumento">
-    <w:name w:val="CT Título do documento"/>
-    <w:basedOn w:val="CTCorpo"/>
-    <w:next w:val="CTPreambulo"/>
-    <w:qFormat/>
-    <w:pPr>
-      <w:keepNext/>
-      <w:keepLines/>
-      <w:spacing w:before="0" w:after="360" w:line="276" w:lineRule="auto"/>
-      <w:jc w:val="center"/>
-      <w:pBdr>
-        <w:bottom w:val="single" w:sz="4" w:space="10" w:color="999999"/>
-      </w:pBdr>
-    </w:pPr>
-    <w:rPr>
-      <w:b/>
-      <w:bCs/>
-      <w:caps/>
-      <w:sz w:val="28"/>
-      <w:szCs w:val="28"/>
-    </w:rPr>
-  </w:style>
-  <w:style w:type="paragraph" w:customStyle="1" w:styleId="CTSecao">
-    <w:name w:val="CT Seção"/>
-    <w:basedOn w:val="CTCorpo"/>
-    <w:next w:val="CTClausulaN1"/>
-    <w:qFormat/>
-    <w:pPr>
-      <w:keepNext/>
-      <w:keepLines/>
-      <w:spacing w:before="280" w:after="120" w:line="276" w:lineRule="auto"/>
-      <w:jc w:val="left"/>
-    </w:pPr>
-    <w:rPr>
-      <w:b/>
-      <w:bCs/>
-      <w:caps/>
-    </w:rPr>
-  </w:style>
-  <w:style w:type="paragraph" w:customStyle="1" w:styleId="CTClausulaN1">
-    <w:name w:val="CT Cláusula nível 1"/>
-    <w:basedOn w:val="CTCorpo"/>
-    <w:next w:val="CTClausulaN1"/>
-    <w:qFormat/>
-    <w:pPr>
-      <w:keepLines/>
-      <w:spacing w:before="0" w:after="200" w:line="276" w:lineRule="auto"/>
-      <w:numPr>
-        <w:ilvl w:val="0"/>
-        <w:numId w:val="90"/>
-      </w:numPr>
-    </w:pPr>
-  </w:style>
-  <w:style w:type="paragraph" w:customStyle="1" w:styleId="CTClausulaN2">
-    <w:name w:val="CT Cláusula nível 2"/>
-    <w:basedOn w:val="CTCorpo"/>
-    <w:next w:val="CTClausulaN2"/>
-    <w:qFormat/>
-    <w:pPr>
-      <w:keepLines/>
-      <w:spacing w:before="0" w:after="120" w:line="276" w:lineRule="auto"/>
-      <w:numPr>
-        <w:ilvl w:val="1"/>
-        <w:numId w:val="90"/>
-      </w:numPr>
-    </w:pPr>
-  </w:style>
-  <w:style w:type="paragraph" w:customStyle="1" w:styleId="CTPreambulo">
-    <w:name w:val="CT Preâmbulo"/>
-    <w:basedOn w:val="CTCorpo"/>
-    <w:next w:val="CTCorpo"/>
-    <w:qFormat/>
-    <w:pPr>
-      <w:spacing w:before="0" w:after="200" w:line="276" w:lineRule="auto"/>
-    </w:pPr>
-  </w:style>
-  <w:style w:type="paragraph" w:customStyle="1" w:styleId="CTFecho">
-    <w:name w:val="CT Fecho"/>
-    <w:basedOn w:val="CTCorpo"/>
-    <w:next w:val="CTAssinatura"/>
-    <w:qFormat/>
-    <w:pPr>
-      <w:spacing w:before="0" w:after="200" w:line="276" w:lineRule="auto"/>
-    </w:pPr>
-  </w:style>
-  <w:style w:type="paragraph" w:customStyle="1" w:styleId="CTAssinatura">
-    <w:name w:val="CT Assinatura"/>
-    <w:basedOn w:val="CTCorpo"/>
-    <w:next w:val="CTAssinatura"/>
-    <w:qFormat/>
-    <w:pPr>
-      <w:keepNext/>
-      <w:keepLines/>
-      <w:spacing w:before="0" w:after="0" w:line="240" w:lineRule="auto"/>
-      <w:jc w:val="center"/>
-    </w:pPr>
-    <w:rPr>
-      <w:sz w:val="20"/>
-      <w:szCs w:val="20"/>
-    </w:rPr>
-  </w:style>
-  <w:style w:type="paragraph" w:customStyle="1" w:styleId="CTCabecalho">
-    <w:name w:val="CT Cabeçalho"/>
-    <w:basedOn w:val="Normal"/>
-    <w:next w:val="CTCabecalho"/>
-    <w:qFormat/>
-    <w:pPr>
-      <w:spacing w:before="0" w:after="0"/>
-      <w:jc w:val="right"/>
-    </w:pPr>
-    <w:rPr>
-      <w:rFonts w:ascii="Cambria" w:hAnsi="Cambria" w:eastAsia="Cambria" w:cs="Cambria"/>
-      <w:sz w:val="18"/>
-      <w:szCs w:val="18"/>
-    </w:rPr>
-  </w:style>
-  <w:style w:type="paragraph" w:customStyle="1" w:styleId="CTRodape">
-    <w:name w:val="CT Rodapé"/>
-    <w:basedOn w:val="Normal"/>
-    <w:next w:val="CTRodape"/>
-    <w:qFormat/>
-    <w:pPr>
-      <w:spacing w:before="0" w:after="0"/>
-      <w:jc w:val="left"/>
-    </w:pPr>
-    <w:rPr>
-      <w:rFonts w:ascii="Cambria" w:hAnsi="Cambria" w:eastAsia="Cambria" w:cs="Cambria"/>
-      <w:sz w:val="18"/>
-      <w:szCs w:val="18"/>
-    </w:rPr>
-  </w:style>
-  <w:style w:type="paragraph" w:customStyle="1" w:styleId="CTMarcaPrevia">
-    <w:name w:val="CT Marca de prévia"/>
-    <w:basedOn w:val="Normal"/>
-    <w:next w:val="CTMarcaPrevia"/>
-    <w:qFormat/>
-    <w:pPr>
-      <w:spacing w:before="0" w:after="0"/>
-      <w:jc w:val="center"/>
-    </w:pPr>
-    <w:rPr>
-      <w:rFonts w:ascii="Cambria" w:hAnsi="Cambria" w:eastAsia="Cambria" w:cs="Cambria"/>
-      <w:b/>
-      <w:bCs/>
-      <w:caps/>
-      <w:sz w:val="18"/>
-      <w:szCs w:val="18"/>
-    </w:rPr>
-  </w:style>
-  <w:style w:type="character" w:customStyle="1" w:styleId="CTCabecalhoCaractere">
-    <w:name w:val="CT Cabeçalho caractere"/>
-    <w:basedOn w:val="DefaultParagraphFont"/>
-    <w:rPr>
-      <w:rFonts w:ascii="Cambria" w:hAnsi="Cambria" w:eastAsia="Cambria" w:cs="Cambria"/>
-      <w:sz w:val="18"/>
-      <w:szCs w:val="18"/>
-    </w:rPr>
-  </w:style>
-  <w:style w:type="paragraph" w:customStyle="1" w:styleId="CTAssinaturaLinha">
-    <w:name w:val="CT Linha de assinatura"/>
-    <w:basedOn w:val="CTAssinatura"/>
-    <w:next w:val="CTAssinatura"/>
-    <w:pPr>
-      <w:keepNext/>
-      <w:keepLines/>
-      <w:pBdr>
-        <w:top w:val="single" w:sz="6" w:space="5" w:color="333333"/>
-      </w:pBdr>
-    </w:pPr>
-  </w:style>
-  <w:style w:type="character" w:customStyle="1" w:styleId="CTAssinaturaNome">
-    <w:name w:val="CT Nome da assinatura"/>
-    <w:basedOn w:val="DefaultParagraphFont"/>
-    <w:rPr>
-      <w:rFonts w:ascii="Cambria" w:hAnsi="Cambria" w:eastAsia="Cambria" w:cs="Cambria"/>
-      <w:b/>
-      <w:bCs/>
-      <w:sz w:val="20"/>
-      <w:szCs w:val="20"/>
-    </w:rPr>
-  </w:style>
-  <w:style w:type="character" w:customStyle="1" w:styleId="CTAssinaturaQualificacao">
-    <w:name w:val="CT Qualificação da assinatura"/>
-    <w:basedOn w:val="DefaultParagraphFont"/>
-    <w:rPr>
-      <w:rFonts w:ascii="Cambria" w:hAnsi="Cambria" w:eastAsia="Cambria" w:cs="Cambria"/>
-      <w:sz w:val="18"/>
-      <w:szCs w:val="18"/>
-    </w:rPr>
-  </w:style>
 </w:styles>
 </file>
</xml_diff>

<commit_message>
promote: people operations, schedules and absences
Files match validated main at 773db8a1b741d0cfdce11b418514365fcb8f6d23 (PR #432).
</commit_message>
<xml_diff>
--- a/docs/modelos-documentos/admissionais/06-vale-transporte-solicitacao-v3.docx
+++ b/docs/modelos-documentos/admissionais/06-vale-transporte-solicitacao-v3.docx
@@ -1,112 +1,336 @@
 
 <file path=word/document.xml><?xml version="1.0" encoding="utf-8"?>
-<w:document xmlns:wpc="http://schemas.microsoft.com/office/word/2010/wordprocessingCanvas" xmlns:mc="http://schemas.openxmlformats.org/markup-compatibility/2006" xmlns:o="urn:schemas-microsoft-com:office:office" xmlns:r="http://schemas.openxmlformats.org/officeDocument/2006/relationships" xmlns:m="http://schemas.openxmlformats.org/officeDocument/2006/math" xmlns:v="urn:schemas-microsoft-com:vml" xmlns:wp14="http://schemas.microsoft.com/office/word/2010/wordprocessingDrawing" xmlns:wp="http://schemas.openxmlformats.org/drawingml/2006/wordprocessingDrawing" xmlns:w10="urn:schemas-microsoft-com:office:word" xmlns:w="http://schemas.openxmlformats.org/wordprocessingml/2006/main" xmlns:w14="http://schemas.microsoft.com/office/word/2010/wordml" xmlns:w15="http://schemas.microsoft.com/office/word/2012/wordml" xmlns:wpg="http://schemas.microsoft.com/office/word/2010/wordprocessingGroup" xmlns:wpi="http://schemas.microsoft.com/office/word/2010/wordprocessingInk" xmlns:wne="http://schemas.microsoft.com/office/word/2006/wordml" xmlns:wps="http://schemas.microsoft.com/office/word/2010/wordprocessingShape" xmlns:cx="http://schemas.microsoft.com/office/drawing/2014/chartex" xmlns:cx1="http://schemas.microsoft.com/office/drawing/2015/9/8/chartex" xmlns:cx2="http://schemas.microsoft.com/office/drawing/2015/10/21/chartex" xmlns:cx3="http://schemas.microsoft.com/office/drawing/2016/5/9/chartex" xmlns:cx4="http://schemas.microsoft.com/office/drawing/2016/5/10/chartex" xmlns:cx5="http://schemas.microsoft.com/office/drawing/2016/5/11/chartex" xmlns:cx6="http://schemas.microsoft.com/office/drawing/2016/5/12/chartex" xmlns:cx7="http://schemas.microsoft.com/office/drawing/2016/5/13/chartex" xmlns:cx8="http://schemas.microsoft.com/office/drawing/2016/5/14/chartex" xmlns:aink="http://schemas.microsoft.com/office/drawing/2016/ink" xmlns:am3d="http://schemas.microsoft.com/office/drawing/2017/model3d" xmlns:w16cex="http://schemas.microsoft.com/office/word/2018/wordml/cex" xmlns:w16cid="http://schemas.microsoft.com/office/word/2016/wordml/cid" xmlns:w16="http://schemas.microsoft.com/office/word/2018/wordml" xmlns:w16sdtdh="http://schemas.microsoft.com/office/word/2020/wordml/sdtdatahash" xmlns:w16se="http://schemas.microsoft.com/office/word/2015/wordml/symex" mc:Ignorable="w14 w15 wp14">
+<w:document xmlns:ns1="http://schemas.openxmlformats.org/markup-compatibility/2006" xmlns:ns2="http://schemas.openxmlformats.org/officeDocument/2006/relationships" xmlns:w="http://schemas.openxmlformats.org/wordprocessingml/2006/main" ns1:Ignorable="w14 w15 wp14">
   <w:body>
     <w:p>
       <w:pPr>
-        <w:pStyle w:val="CTTituloDocumento"/>
-      </w:pPr>
-      <w:r>
+        <w:spacing w:after="300" w:before="0"/>
+        <w:jc w:val="center"/>
+      </w:pPr>
+      <w:r>
+        <w:rPr>
+          <w:rFonts w:ascii="Calibri" w:cs="Calibri" w:eastAsia="Calibri" w:hAnsi="Calibri"/>
+          <w:b/>
+          <w:bCs/>
+          <w:sz w:val="36"/>
+          <w:szCs w:val="36"/>
+        </w:rPr>
         <w:t xml:space="preserve">SOLICITAÇÃO DE VALE-TRANSPORTE</w:t>
       </w:r>
     </w:p>
     <w:p>
       <w:pPr>
-        <w:pStyle w:val="CTPreambulo"/>
-      </w:pPr>
-    </w:p>
-    <w:p>
-      <w:pPr>
-        <w:pStyle w:val="CTPreambulo"/>
-      </w:pPr>
-      <w:r>
-        <w:t xml:space="preserve">Eu, {{employee.name}}, portador(a) da CTPS n˚ {{employee.ctps_number}} e série n˚ {{employee.ctps_series}}, doravante designado(a) como EMPREGADO(A), nos termos do artigo 7º do Decreto n˚ 95.247, de 17 de novembro de 1987, declaro que {{transport_voucher_decision_text}} pela utilização do Vale-Transporte para o deslocamento residência–trabalho e vice-versa.</w:t>
-      </w:r>
-    </w:p>
-    <w:p>
-      <w:pPr>
-        <w:pStyle w:val="CTPreambulo"/>
-      </w:pPr>
-      <w:r>
-        <w:t xml:space="preserve">Informações para a concessão do benefício, nos termos do artigo 7º do Decreto n˚ 95.247/87:</w:t>
-      </w:r>
-    </w:p>
-    <w:p>
-      <w:pPr>
-        <w:pStyle w:val="CTPreambulo"/>
-      </w:pPr>
-      <w:r>
+        <w:pBdr>
+          <w:bottom w:val="single" w:color="999999" w:sz="6"/>
+        </w:pBdr>
+        <w:spacing w:after="300" w:before="0"/>
+      </w:pPr>
+      <w:r>
+        <w:t xml:space="preserve"/>
+      </w:r>
+    </w:p>
+    <w:p>
+      <w:pPr>
+        <w:spacing w:after="180" w:before="0" w:line="320"/>
+        <w:jc w:val="both"/>
+      </w:pPr>
+      <w:r>
+        <w:rPr>
+          <w:rFonts w:ascii="Calibri" w:cs="Calibri" w:eastAsia="Calibri" w:hAnsi="Calibri"/>
+          <w:sz w:val="22"/>
+          <w:szCs w:val="22"/>
+        </w:rPr>
+        <w:t xml:space="preserve">Eu, {{employee.name}}, portador(a) da CTPS n˚ {{employee.ctps_number}} e série n˚ {{employee.ctps_series}}, doravante designado(a) como EMPREGADO(A), declaro que {{transport_voucher_decision_text}} pela utilização do vale-transporte para o deslocamento residência–trabalho e vice-versa.</w:t>
+      </w:r>
+      <w:r>
+        <w:rPr>
+          <w:rFonts w:ascii="Calibri" w:cs="Calibri" w:eastAsia="Calibri" w:hAnsi="Calibri"/>
+          <w:b/>
+          <w:bCs/>
+          <w:sz w:val="22"/>
+          <w:szCs w:val="22"/>
+        </w:rPr>
+        <w:t xml:space="preserve"/>
+      </w:r>
+      <w:r>
+        <w:rPr>
+          <w:rFonts w:ascii="Calibri" w:cs="Calibri" w:eastAsia="Calibri" w:hAnsi="Calibri"/>
+          <w:sz w:val="22"/>
+          <w:szCs w:val="22"/>
+        </w:rPr>
+        <w:t xml:space="preserve"/>
+      </w:r>
+      <w:r>
+        <w:rPr>
+          <w:rFonts w:ascii="Calibri" w:cs="Calibri" w:eastAsia="Calibri" w:hAnsi="Calibri"/>
+          <w:b/>
+          <w:bCs/>
+          <w:sz w:val="22"/>
+          <w:szCs w:val="22"/>
+        </w:rPr>
+        <w:t xml:space="preserve"/>
+      </w:r>
+      <w:r>
+        <w:rPr>
+          <w:rFonts w:ascii="Calibri" w:cs="Calibri" w:eastAsia="Calibri" w:hAnsi="Calibri"/>
+          <w:sz w:val="22"/>
+          <w:szCs w:val="22"/>
+        </w:rPr>
+        <w:t xml:space="preserve"/>
+      </w:r>
+      <w:r>
+        <w:rPr>
+          <w:rFonts w:ascii="Calibri" w:cs="Calibri" w:eastAsia="Calibri" w:hAnsi="Calibri"/>
+          <w:b/>
+          <w:bCs/>
+          <w:sz w:val="22"/>
+          <w:szCs w:val="22"/>
+        </w:rPr>
+        <w:t xml:space="preserve"/>
+      </w:r>
+      <w:r>
+        <w:rPr>
+          <w:rFonts w:ascii="Calibri" w:cs="Calibri" w:eastAsia="Calibri" w:hAnsi="Calibri"/>
+          <w:sz w:val="22"/>
+          <w:szCs w:val="22"/>
+        </w:rPr>
+        <w:t xml:space="preserve"/>
+      </w:r>
+    </w:p>
+    <w:p>
+      <w:pPr>
+        <w:spacing w:after="180" w:before="0" w:line="320"/>
+        <w:jc w:val="both"/>
+      </w:pPr>
+      <w:r>
+        <w:rPr>
+          <w:rFonts w:ascii="Calibri" w:cs="Calibri" w:eastAsia="Calibri" w:hAnsi="Calibri"/>
+          <w:b/>
+          <w:bCs/>
+          <w:sz w:val="22"/>
+          <w:szCs w:val="22"/>
+        </w:rPr>
+        <w:t xml:space="preserve">Informações para a concessão do benefício:</w:t>
+      </w:r>
+    </w:p>
+    <w:p>
+      <w:pPr>
+        <w:pStyle w:val="ListParagraph"/>
+        <w:numPr>
+          <w:ilvl w:val="0"/>
+          <w:numId w:val="1"/>
+        </w:numPr>
+        <w:spacing w:after="60" w:before="60" w:line="320"/>
+        <w:jc w:val="both"/>
+      </w:pPr>
+      <w:r>
+        <w:rPr>
+          <w:rFonts w:ascii="Calibri" w:cs="Calibri" w:eastAsia="Calibri" w:hAnsi="Calibri"/>
+          <w:b/>
+          <w:bCs/>
+          <w:sz w:val="22"/>
+          <w:szCs w:val="22"/>
+        </w:rPr>
         <w:t xml:space="preserve">Endereço residencial: {{employee.address}}</w:t>
       </w:r>
     </w:p>
     <w:p>
       <w:pPr>
-        <w:pStyle w:val="CTPreambulo"/>
-      </w:pPr>
-      <w:r>
+        <w:pStyle w:val="ListParagraph"/>
+        <w:numPr>
+          <w:ilvl w:val="0"/>
+          <w:numId w:val="1"/>
+        </w:numPr>
+        <w:spacing w:after="60" w:before="60" w:line="320"/>
+        <w:jc w:val="both"/>
+      </w:pPr>
+      <w:r>
+        <w:rPr>
+          <w:rFonts w:ascii="Calibri" w:cs="Calibri" w:eastAsia="Calibri" w:hAnsi="Calibri"/>
+          <w:b/>
+          <w:bCs/>
+          <w:sz w:val="22"/>
+          <w:szCs w:val="22"/>
+        </w:rPr>
         <w:t xml:space="preserve">Quantidade de passagens por dia trabalhado: 2 (duas), correspondentes ao deslocamento de ida (residência–trabalho) e de volta (trabalho–residência).</w:t>
       </w:r>
     </w:p>
     <w:p>
       <w:pPr>
-        <w:pStyle w:val="CTPreambulo"/>
-      </w:pPr>
-      <w:r>
+        <w:pStyle w:val="ListParagraph"/>
+        <w:numPr>
+          <w:ilvl w:val="0"/>
+          <w:numId w:val="1"/>
+        </w:numPr>
+        <w:spacing w:after="60" w:before="60" w:line="320"/>
+        <w:jc w:val="both"/>
+      </w:pPr>
+      <w:r>
+        <w:rPr>
+          <w:rFonts w:ascii="Calibri" w:cs="Calibri" w:eastAsia="Calibri" w:hAnsi="Calibri"/>
+          <w:b/>
+          <w:bCs/>
+          <w:sz w:val="22"/>
+          <w:szCs w:val="22"/>
+        </w:rPr>
         <w:t xml:space="preserve">O benefício será concedido com base na tarifa vigente do transporte público coletivo do município à época de cada concessão, ficando eventuais reajustes tarifários automaticamente incorporados, independentemente de aditamento ou de nova solicitação.</w:t>
       </w:r>
     </w:p>
     <w:p>
       <w:pPr>
-        <w:pStyle w:val="CTPreambulo"/>
-      </w:pPr>
-      <w:r>
-        <w:t xml:space="preserve">Em caso de opção pelo benefício, também me comprometo a:</w:t>
-      </w:r>
-    </w:p>
-    <w:p>
-      <w:pPr>
-        <w:pStyle w:val="CTPreambulo"/>
-      </w:pPr>
-      <w:r>
+        <w:pStyle w:val="ListParagraph"/>
+        <w:numPr>
+          <w:ilvl w:val="0"/>
+          <w:numId w:val="1"/>
+        </w:numPr>
+        <w:spacing w:after="60" w:before="60" w:line="320"/>
+        <w:jc w:val="both"/>
+      </w:pPr>
+      <w:r>
+        <w:rPr>
+          <w:rFonts w:ascii="Calibri" w:cs="Calibri" w:eastAsia="Calibri" w:hAnsi="Calibri"/>
+          <w:sz w:val="22"/>
+          <w:szCs w:val="22"/>
+        </w:rPr>
         <w:t xml:space="preserve">Utilizá-lo exclusivamente para meu efetivo deslocamento residência–trabalho e vice-versa;</w:t>
       </w:r>
     </w:p>
     <w:p>
       <w:pPr>
-        <w:pStyle w:val="CTPreambulo"/>
-      </w:pPr>
-      <w:r>
-        <w:t xml:space="preserve">Renovar as informações acima anualmente ou sempre que ocorrer alteração no meu endereço residencial ou dos serviços e meios de transporte mais adequados ao meu deslocamento residência–trabalho e vice-versa;</w:t>
-      </w:r>
-    </w:p>
-    <w:p>
-      <w:pPr>
-        <w:pStyle w:val="CTPreambulo"/>
-      </w:pPr>
-      <w:r>
-        <w:t xml:space="preserve">Autorizar o desconto de até 6% (seis por cento) do meu salário básico mensal para contribuir no custeio do Vale-Transporte, conforme o artigo 9º do Decreto n˚ 95.247/87;</w:t>
-      </w:r>
-    </w:p>
-    <w:p>
-      <w:pPr>
-        <w:pStyle w:val="CTPreambulo"/>
-      </w:pPr>
-      <w:r>
-        <w:t xml:space="preserve">Declarar ciência de que a declaração falsa ou o uso indevido do Vale-Transporte constituem falta grave, conforme o §3º do artigo 7º do Decreto n˚ 95.247/87.</w:t>
-      </w:r>
-    </w:p>
-    <w:p>
-      <w:pPr>
-        <w:pStyle w:val="CTPreambulo"/>
-      </w:pPr>
-      <w:r>
+        <w:pStyle w:val="ListParagraph"/>
+        <w:numPr>
+          <w:ilvl w:val="0"/>
+          <w:numId w:val="1"/>
+        </w:numPr>
+        <w:spacing w:after="60" w:before="60" w:line="320"/>
+        <w:jc w:val="both"/>
+      </w:pPr>
+      <w:r>
+        <w:rPr>
+          <w:rFonts w:ascii="Calibri" w:cs="Calibri" w:eastAsia="Calibri" w:hAnsi="Calibri"/>
+          <w:sz w:val="22"/>
+          <w:szCs w:val="22"/>
+        </w:rPr>
+        <w:t xml:space="preserve">Renovar </w:t>
+      </w:r>
+      <w:r>
+        <w:rPr>
+          <w:rFonts w:ascii="Calibri" w:cs="Calibri" w:eastAsia="Calibri" w:hAnsi="Calibri"/>
+          <w:b/>
+          <w:bCs/>
+          <w:sz w:val="22"/>
+          <w:szCs w:val="22"/>
+        </w:rPr>
+        <w:t xml:space="preserve">as informações acima</w:t>
+      </w:r>
+      <w:r>
+        <w:rPr>
+          <w:rFonts w:ascii="Calibri" w:cs="Calibri" w:eastAsia="Calibri" w:hAnsi="Calibri"/>
+          <w:sz w:val="22"/>
+          <w:szCs w:val="22"/>
+        </w:rPr>
+        <w:t xml:space="preserve"> anualmente ou sempre que ocorrer alteração no meu endereço residencial ou dos serviços e meios de transporte mais adequados ao meu deslocamento residência–trabalho e vice-versa;</w:t>
+      </w:r>
+    </w:p>
+    <w:p>
+      <w:pPr>
+        <w:pStyle w:val="ListParagraph"/>
+        <w:numPr>
+          <w:ilvl w:val="0"/>
+          <w:numId w:val="1"/>
+        </w:numPr>
+        <w:spacing w:after="60" w:before="60" w:line="320"/>
+        <w:jc w:val="both"/>
+      </w:pPr>
+      <w:r>
+        <w:rPr>
+          <w:rFonts w:ascii="Calibri" w:cs="Calibri" w:eastAsia="Calibri" w:hAnsi="Calibri"/>
+          <w:b/>
+          <w:bCs/>
+          <w:sz w:val="22"/>
+          <w:szCs w:val="22"/>
+        </w:rPr>
+        <w:t xml:space="preserve">Autorizar o desconto</w:t>
+      </w:r>
+      <w:r>
+        <w:rPr>
+          <w:rFonts w:ascii="Calibri" w:cs="Calibri" w:eastAsia="Calibri" w:hAnsi="Calibri"/>
+          <w:sz w:val="22"/>
+          <w:szCs w:val="22"/>
+        </w:rPr>
+        <w:t xml:space="preserve"> de até 6% (seis por cento) do meu salário básico mensal para contribuir no custeio do vale-transporte, conforme o artigo 9º do Decreto n˚ 95.247/87;</w:t>
+      </w:r>
+    </w:p>
+    <w:p>
+      <w:pPr>
+        <w:pStyle w:val="ListParagraph"/>
+        <w:numPr>
+          <w:ilvl w:val="0"/>
+          <w:numId w:val="1"/>
+        </w:numPr>
+        <w:spacing w:after="60" w:before="60" w:line="320"/>
+        <w:jc w:val="both"/>
+      </w:pPr>
+      <w:r>
+        <w:rPr>
+          <w:rFonts w:ascii="Calibri" w:cs="Calibri" w:eastAsia="Calibri" w:hAnsi="Calibri"/>
+          <w:b/>
+          <w:bCs/>
+          <w:sz w:val="22"/>
+          <w:szCs w:val="22"/>
+        </w:rPr>
+        <w:t xml:space="preserve">Declarar ciência</w:t>
+      </w:r>
+      <w:r>
+        <w:rPr>
+          <w:rFonts w:ascii="Calibri" w:cs="Calibri" w:eastAsia="Calibri" w:hAnsi="Calibri"/>
+          <w:sz w:val="22"/>
+          <w:szCs w:val="22"/>
+        </w:rPr>
+        <w:t xml:space="preserve"> de que a declaração falsa ou o uso indevido do vale-transporte constituem falta grave, conforme o </w:t>
+      </w:r>
+      <w:r>
+        <w:rPr>
+          <w:rFonts w:ascii="Calibri" w:cs="Calibri" w:eastAsia="Calibri" w:hAnsi="Calibri"/>
+          <w:b/>
+          <w:bCs/>
+          <w:sz w:val="22"/>
+          <w:szCs w:val="22"/>
+        </w:rPr>
+        <w:t xml:space="preserve">§3º</w:t>
+      </w:r>
+      <w:r>
+        <w:rPr>
+          <w:rFonts w:ascii="Calibri" w:cs="Calibri" w:eastAsia="Calibri" w:hAnsi="Calibri"/>
+          <w:sz w:val="22"/>
+          <w:szCs w:val="22"/>
+        </w:rPr>
+        <w:t xml:space="preserve"> do artigo 7º do Decreto n˚ 95.247/87.</w:t>
+      </w:r>
+    </w:p>
+    <w:p>
+      <w:pPr>
+        <w:spacing w:after="180" w:before="0" w:line="320"/>
+        <w:jc w:val="both"/>
+      </w:pPr>
+      <w:r>
+        <w:rPr>
+          <w:rFonts w:ascii="Calibri" w:cs="Calibri" w:eastAsia="Calibri" w:hAnsi="Calibri"/>
+          <w:b/>
+          <w:bCs/>
+          <w:sz w:val="22"/>
+          <w:szCs w:val="22"/>
+        </w:rPr>
         <w:t xml:space="preserve">Em caso de não opção, declaro estar ciente de que o benefício não me será concedido por minha própria escolha e de que poderei requerê-lo a qualquer tempo, mediante nova solicitação acompanhada das informações exigidas.</w:t>
       </w:r>
     </w:p>
     <w:p>
       <w:pPr>
-        <w:pStyle w:val="CTPreambulo"/>
-      </w:pPr>
+        <w:spacing w:after="200" w:before="400"/>
+      </w:pPr>
+      <w:r>
+        <w:t xml:space="preserve"/>
+      </w:r>
     </w:p>
     <w:tbl>
       <w:tblPr>
@@ -142,27 +366,48 @@
           </w:tcPr>
           <w:p>
             <w:pPr>
-              <w:pStyle w:val="CTPreambulo"/>
+              <w:pBdr>
+                <w:bottom w:val="single" w:color="000000" w:sz="6"/>
+              </w:pBdr>
+              <w:spacing w:after="0" w:before="0"/>
+              <w:jc w:val="center"/>
             </w:pPr>
+            <w:r>
+              <w:rPr>
+                <w:rFonts w:ascii="Calibri" w:cs="Calibri" w:eastAsia="Calibri" w:hAnsi="Calibri"/>
+                <w:sz w:val="22"/>
+                <w:szCs w:val="22"/>
+              </w:rPr>
+              <w:t xml:space="preserve"/>
+            </w:r>
           </w:p>
           <w:p>
             <w:pPr>
-              <w:pStyle w:val="CTAssinaturaLinha"/>
+              <w:spacing w:after="0" w:before="80"/>
+              <w:jc w:val="center"/>
             </w:pPr>
             <w:r>
               <w:rPr>
-                <w:rStyle w:val="CTAssinaturaNome"/>
+                <w:rFonts w:ascii="Calibri" w:cs="Calibri" w:eastAsia="Calibri" w:hAnsi="Calibri"/>
+                <w:b/>
+                <w:bCs/>
+                <w:sz w:val="22"/>
+                <w:szCs w:val="22"/>
               </w:rPr>
               <w:t xml:space="preserve">{{employee.name}}</w:t>
             </w:r>
           </w:p>
           <w:p>
             <w:pPr>
-              <w:pStyle w:val="CTAssinatura"/>
+              <w:spacing w:after="0" w:before="0"/>
+              <w:jc w:val="center"/>
             </w:pPr>
             <w:r>
               <w:rPr>
-                <w:rStyle w:val="CTAssinaturaQualificacao"/>
+                <w:rFonts w:ascii="Calibri" w:cs="Calibri" w:eastAsia="Calibri" w:hAnsi="Calibri"/>
+                <w:color w:val="666666"/>
+                <w:sz w:val="18"/>
+                <w:szCs w:val="18"/>
               </w:rPr>
               <w:t xml:space="preserve">EMPREGADO(A)</w:t>
             </w:r>
@@ -179,9 +424,9 @@
             </w:tcBorders>
           </w:tcPr>
           <w:p>
-            <w:pPr>
-              <w:pStyle w:val="CTPreambulo"/>
-            </w:pPr>
+            <w:r>
+              <w:t xml:space="preserve"/>
+            </w:r>
           </w:p>
         </w:tc>
         <w:tc>
@@ -197,27 +442,48 @@
           </w:tcPr>
           <w:p>
             <w:pPr>
-              <w:pStyle w:val="CTPreambulo"/>
+              <w:pBdr>
+                <w:bottom w:val="single" w:color="000000" w:sz="6"/>
+              </w:pBdr>
+              <w:spacing w:after="0" w:before="0"/>
+              <w:jc w:val="center"/>
             </w:pPr>
+            <w:r>
+              <w:rPr>
+                <w:rFonts w:ascii="Calibri" w:cs="Calibri" w:eastAsia="Calibri" w:hAnsi="Calibri"/>
+                <w:sz w:val="22"/>
+                <w:szCs w:val="22"/>
+              </w:rPr>
+              <w:t xml:space="preserve"/>
+            </w:r>
           </w:p>
           <w:p>
             <w:pPr>
-              <w:pStyle w:val="CTAssinaturaLinha"/>
+              <w:spacing w:after="0" w:before="80"/>
+              <w:jc w:val="center"/>
             </w:pPr>
             <w:r>
               <w:rPr>
-                <w:rStyle w:val="CTAssinaturaNome"/>
+                <w:rFonts w:ascii="Calibri" w:cs="Calibri" w:eastAsia="Calibri" w:hAnsi="Calibri"/>
+                <w:b/>
+                <w:bCs/>
+                <w:sz w:val="22"/>
+                <w:szCs w:val="22"/>
               </w:rPr>
               <w:t xml:space="preserve">{{integration.employer_name}}</w:t>
             </w:r>
           </w:p>
           <w:p>
             <w:pPr>
-              <w:pStyle w:val="CTAssinatura"/>
+              <w:spacing w:after="0" w:before="0"/>
+              <w:jc w:val="center"/>
             </w:pPr>
             <w:r>
               <w:rPr>
-                <w:rStyle w:val="CTAssinaturaQualificacao"/>
+                <w:rFonts w:ascii="Calibri" w:cs="Calibri" w:eastAsia="Calibri" w:hAnsi="Calibri"/>
+                <w:color w:val="666666"/>
+                <w:sz w:val="18"/>
+                <w:szCs w:val="18"/>
               </w:rPr>
               <w:t xml:space="preserve">EMPREGADORA</w:t>
             </w:r>
@@ -226,10 +492,10 @@
       </w:tr>
     </w:tbl>
     <w:sectPr>
-      <w:headerReference w:type="default" r:id="rId7"/>
-      <w:footerReference w:type="default" r:id="rId8"/>
-      <w:pgSz w:w="11906" w:h="16838"/>
-      <w:pgMar w:top="1417" w:right="1701" w:bottom="1417" w:left="1701" w:header="709" w:footer="709" w:gutter="0"/>
+      <w:headerReference w:type="default" ns2:id="rId7"/>
+      <w:footerReference w:type="default" ns2:id="rId8"/>
+      <w:pgSz w:w="11906" w:h="16838" w:orient="portrait"/>
+      <w:pgMar w:top="1440" w:right="1600" w:bottom="1440" w:left="1600" w:header="708" w:footer="708" w:gutter="0"/>
       <w:pgNumType/>
       <w:docGrid w:linePitch="360"/>
     </w:sectPr>
@@ -282,8 +548,17 @@
 <w:ftr xmlns:w="http://schemas.openxmlformats.org/wordprocessingml/2006/main">
   <w:p>
     <w:pPr>
-      <w:pStyle w:val="CTRodape"/>
+      <w:jc w:val="left"/>
     </w:pPr>
+    <w:r>
+      <w:rPr>
+        <w:rFonts w:ascii="Calibri" w:cs="Calibri" w:eastAsia="Calibri" w:hAnsi="Calibri"/>
+        <w:color w:val="888888"/>
+        <w:sz w:val="16"/>
+        <w:szCs w:val="16"/>
+      </w:rPr>
+      <w:t xml:space="preserve">vale-transporte — CT Sorvetes Ltda</w:t>
+    </w:r>
   </w:p>
 </w:ftr>
 </file>
@@ -326,41 +601,52 @@
 </file>
 
 <file path=word/header1.xml><?xml version="1.0" encoding="utf-8"?>
-<w:hdr xmlns:w="http://schemas.openxmlformats.org/wordprocessingml/2006/main">
+<w:hdr xmlns:wpc="http://schemas.microsoft.com/office/word/2010/wordprocessingCanvas" xmlns:mc="http://schemas.openxmlformats.org/markup-compatibility/2006" xmlns:o="urn:schemas-microsoft-com:office:office" xmlns:r="http://schemas.openxmlformats.org/officeDocument/2006/relationships" xmlns:m="http://schemas.openxmlformats.org/officeDocument/2006/math" xmlns:v="urn:schemas-microsoft-com:vml" xmlns:wp14="http://schemas.microsoft.com/office/word/2010/wordprocessingDrawing" xmlns:wp="http://schemas.openxmlformats.org/drawingml/2006/wordprocessingDrawing" xmlns:w10="urn:schemas-microsoft-com:office:word" xmlns:w="http://schemas.openxmlformats.org/wordprocessingml/2006/main" xmlns:w14="http://schemas.microsoft.com/office/word/2010/wordml" xmlns:w15="http://schemas.microsoft.com/office/word/2012/wordml" xmlns:wpg="http://schemas.microsoft.com/office/word/2010/wordprocessingGroup" xmlns:wpi="http://schemas.microsoft.com/office/word/2010/wordprocessingInk" xmlns:wne="http://schemas.microsoft.com/office/word/2006/wordml" xmlns:wps="http://schemas.microsoft.com/office/word/2010/wordprocessingShape" xmlns:cx="http://schemas.microsoft.com/office/drawing/2014/chartex" xmlns:cx1="http://schemas.microsoft.com/office/drawing/2015/9/8/chartex" xmlns:cx2="http://schemas.microsoft.com/office/drawing/2015/10/21/chartex" xmlns:cx3="http://schemas.microsoft.com/office/drawing/2016/5/9/chartex" xmlns:cx4="http://schemas.microsoft.com/office/drawing/2016/5/10/chartex" xmlns:cx5="http://schemas.microsoft.com/office/drawing/2016/5/11/chartex" xmlns:cx6="http://schemas.microsoft.com/office/drawing/2016/5/12/chartex" xmlns:cx7="http://schemas.microsoft.com/office/drawing/2016/5/13/chartex" xmlns:cx8="http://schemas.microsoft.com/office/drawing/2016/5/14/chartex" xmlns:w16cid="http://schemas.microsoft.com/office/word/2016/wordml/cid" xmlns:w16se="http://schemas.microsoft.com/office/word/2015/wordml/symex">
   <w:p>
     <w:pPr>
-      <w:pStyle w:val="CTCabecalho"/>
+      <w:spacing w:after="0" w:before="0"/>
+      <w:jc w:val="right"/>
     </w:pPr>
     <w:r>
       <w:rPr>
-        <w:rStyle w:val="CTCabecalhoCaractere"/>
+        <w:rFonts w:ascii="Calibri" w:cs="Calibri" w:eastAsia="Calibri" w:hAnsi="Calibri"/>
+        <w:color w:val="888888"/>
+        <w:sz w:val="16"/>
+        <w:szCs w:val="16"/>
       </w:rPr>
       <w:t xml:space="preserve">Página </w:t>
     </w:r>
     <w:r>
       <w:rPr>
-        <w:rStyle w:val="CTCabecalhoCaractere"/>
+        <w:rFonts w:ascii="Calibri" w:cs="Calibri" w:eastAsia="Calibri" w:hAnsi="Calibri"/>
+        <w:color w:val="888888"/>
+        <w:sz w:val="16"/>
+        <w:szCs w:val="16"/>
       </w:rPr>
       <w:fldChar w:fldCharType="begin"/>
-      <w:instrText xml:space="preserve"> PAGE </w:instrText>
+      <w:instrText xml:space="preserve">PAGE</w:instrText>
       <w:fldChar w:fldCharType="separate"/>
-      <w:t>1</w:t>
       <w:fldChar w:fldCharType="end"/>
     </w:r>
     <w:r>
       <w:rPr>
-        <w:rStyle w:val="CTCabecalhoCaractere"/>
+        <w:rFonts w:ascii="Calibri" w:cs="Calibri" w:eastAsia="Calibri" w:hAnsi="Calibri"/>
+        <w:color w:val="888888"/>
+        <w:sz w:val="16"/>
+        <w:szCs w:val="16"/>
       </w:rPr>
       <w:t xml:space="preserve"> de </w:t>
     </w:r>
     <w:r>
       <w:rPr>
-        <w:rStyle w:val="CTCabecalhoCaractere"/>
+        <w:rFonts w:ascii="Calibri" w:cs="Calibri" w:eastAsia="Calibri" w:hAnsi="Calibri"/>
+        <w:color w:val="888888"/>
+        <w:sz w:val="16"/>
+        <w:szCs w:val="16"/>
       </w:rPr>
       <w:fldChar w:fldCharType="begin"/>
-      <w:instrText xml:space="preserve"> NUMPAGES </w:instrText>
+      <w:instrText xml:space="preserve">NUMPAGES</w:instrText>
       <w:fldChar w:fldCharType="separate"/>
-      <w:t>1</w:t>
       <w:fldChar w:fldCharType="end"/>
     </w:r>
   </w:p>
@@ -458,46 +744,6 @@
     <w:lvlOverride w:ilvl="0">
       <w:startOverride w:val="1"/>
     </w:lvlOverride>
-  </w:num>
-  <w:abstractNum w:abstractNumId="90">
-    <w:multiLevelType w:val="multilevel"/>
-    <w:lvl w:ilvl="0">
-      <w:start w:val="1"/>
-      <w:numFmt w:val="decimal"/>
-      <w:pStyle w:val="CTClausulaN1"/>
-      <w:lvlText w:val="%1."/>
-      <w:lvlJc w:val="left"/>
-      <w:pPr>
-        <w:ind w:left="425" w:hanging="425"/>
-      </w:pPr>
-      <w:rPr>
-        <w:rFonts w:ascii="Cambria" w:hAnsi="Cambria" w:eastAsia="Cambria" w:cs="Cambria"/>
-        <w:b/>
-        <w:bCs/>
-        <w:sz w:val="22"/>
-        <w:szCs w:val="22"/>
-      </w:rPr>
-    </w:lvl>
-    <w:lvl w:ilvl="1">
-      <w:start w:val="1"/>
-      <w:numFmt w:val="decimal"/>
-      <w:pStyle w:val="CTClausulaN2"/>
-      <w:lvlText w:val="%1.%2."/>
-      <w:lvlJc w:val="left"/>
-      <w:pPr>
-        <w:ind w:left="992" w:hanging="567"/>
-      </w:pPr>
-      <w:rPr>
-        <w:rFonts w:ascii="Cambria" w:hAnsi="Cambria" w:eastAsia="Cambria" w:cs="Cambria"/>
-        <w:b/>
-        <w:bCs/>
-        <w:sz w:val="22"/>
-        <w:szCs w:val="22"/>
-      </w:rPr>
-    </w:lvl>
-  </w:abstractNum>
-  <w:num w:numId="90">
-    <w:abstractNumId w:val="90"/>
   </w:num>
 </w:numbering>
 </file>
@@ -685,211 +931,5 @@
       <w:szCs w:val="20"/>
     </w:rPr>
   </w:style>
-  <w:style w:type="paragraph" w:customStyle="1" w:styleId="CTCorpo">
-    <w:name w:val="CT Corpo"/>
-    <w:basedOn w:val="Normal"/>
-    <w:next w:val="CTCorpo"/>
-    <w:qFormat/>
-    <w:pPr>
-      <w:widowControl/>
-      <w:spacing w:before="0" w:after="200" w:line="276" w:lineRule="auto"/>
-      <w:jc w:val="both"/>
-    </w:pPr>
-    <w:rPr>
-      <w:rFonts w:ascii="Cambria" w:hAnsi="Cambria" w:eastAsia="Cambria" w:cs="Cambria"/>
-      <w:sz w:val="22"/>
-      <w:szCs w:val="22"/>
-    </w:rPr>
-  </w:style>
-  <w:style w:type="paragraph" w:customStyle="1" w:styleId="CTTituloDocumento">
-    <w:name w:val="CT Título do documento"/>
-    <w:basedOn w:val="CTCorpo"/>
-    <w:next w:val="CTPreambulo"/>
-    <w:qFormat/>
-    <w:pPr>
-      <w:keepNext/>
-      <w:keepLines/>
-      <w:spacing w:before="0" w:after="360" w:line="276" w:lineRule="auto"/>
-      <w:jc w:val="center"/>
-      <w:pBdr>
-        <w:bottom w:val="single" w:sz="4" w:space="10" w:color="999999"/>
-      </w:pBdr>
-    </w:pPr>
-    <w:rPr>
-      <w:b/>
-      <w:bCs/>
-      <w:caps/>
-      <w:sz w:val="28"/>
-      <w:szCs w:val="28"/>
-    </w:rPr>
-  </w:style>
-  <w:style w:type="paragraph" w:customStyle="1" w:styleId="CTSecao">
-    <w:name w:val="CT Seção"/>
-    <w:basedOn w:val="CTCorpo"/>
-    <w:next w:val="CTClausulaN1"/>
-    <w:qFormat/>
-    <w:pPr>
-      <w:keepNext/>
-      <w:keepLines/>
-      <w:spacing w:before="280" w:after="120" w:line="276" w:lineRule="auto"/>
-      <w:jc w:val="left"/>
-    </w:pPr>
-    <w:rPr>
-      <w:b/>
-      <w:bCs/>
-      <w:caps/>
-    </w:rPr>
-  </w:style>
-  <w:style w:type="paragraph" w:customStyle="1" w:styleId="CTClausulaN1">
-    <w:name w:val="CT Cláusula nível 1"/>
-    <w:basedOn w:val="CTCorpo"/>
-    <w:next w:val="CTClausulaN1"/>
-    <w:qFormat/>
-    <w:pPr>
-      <w:keepLines/>
-      <w:spacing w:before="0" w:after="200" w:line="276" w:lineRule="auto"/>
-      <w:numPr>
-        <w:ilvl w:val="0"/>
-        <w:numId w:val="90"/>
-      </w:numPr>
-    </w:pPr>
-  </w:style>
-  <w:style w:type="paragraph" w:customStyle="1" w:styleId="CTClausulaN2">
-    <w:name w:val="CT Cláusula nível 2"/>
-    <w:basedOn w:val="CTCorpo"/>
-    <w:next w:val="CTClausulaN2"/>
-    <w:qFormat/>
-    <w:pPr>
-      <w:keepLines/>
-      <w:spacing w:before="0" w:after="120" w:line="276" w:lineRule="auto"/>
-      <w:numPr>
-        <w:ilvl w:val="1"/>
-        <w:numId w:val="90"/>
-      </w:numPr>
-    </w:pPr>
-  </w:style>
-  <w:style w:type="paragraph" w:customStyle="1" w:styleId="CTPreambulo">
-    <w:name w:val="CT Preâmbulo"/>
-    <w:basedOn w:val="CTCorpo"/>
-    <w:next w:val="CTCorpo"/>
-    <w:qFormat/>
-    <w:pPr>
-      <w:spacing w:before="0" w:after="200" w:line="276" w:lineRule="auto"/>
-    </w:pPr>
-  </w:style>
-  <w:style w:type="paragraph" w:customStyle="1" w:styleId="CTFecho">
-    <w:name w:val="CT Fecho"/>
-    <w:basedOn w:val="CTCorpo"/>
-    <w:next w:val="CTAssinatura"/>
-    <w:qFormat/>
-    <w:pPr>
-      <w:spacing w:before="0" w:after="200" w:line="276" w:lineRule="auto"/>
-    </w:pPr>
-  </w:style>
-  <w:style w:type="paragraph" w:customStyle="1" w:styleId="CTAssinatura">
-    <w:name w:val="CT Assinatura"/>
-    <w:basedOn w:val="CTCorpo"/>
-    <w:next w:val="CTAssinatura"/>
-    <w:qFormat/>
-    <w:pPr>
-      <w:keepNext/>
-      <w:keepLines/>
-      <w:spacing w:before="0" w:after="0" w:line="240" w:lineRule="auto"/>
-      <w:jc w:val="center"/>
-    </w:pPr>
-    <w:rPr>
-      <w:sz w:val="20"/>
-      <w:szCs w:val="20"/>
-    </w:rPr>
-  </w:style>
-  <w:style w:type="paragraph" w:customStyle="1" w:styleId="CTCabecalho">
-    <w:name w:val="CT Cabeçalho"/>
-    <w:basedOn w:val="Normal"/>
-    <w:next w:val="CTCabecalho"/>
-    <w:qFormat/>
-    <w:pPr>
-      <w:spacing w:before="0" w:after="0"/>
-      <w:jc w:val="right"/>
-    </w:pPr>
-    <w:rPr>
-      <w:rFonts w:ascii="Cambria" w:hAnsi="Cambria" w:eastAsia="Cambria" w:cs="Cambria"/>
-      <w:sz w:val="18"/>
-      <w:szCs w:val="18"/>
-    </w:rPr>
-  </w:style>
-  <w:style w:type="paragraph" w:customStyle="1" w:styleId="CTRodape">
-    <w:name w:val="CT Rodapé"/>
-    <w:basedOn w:val="Normal"/>
-    <w:next w:val="CTRodape"/>
-    <w:qFormat/>
-    <w:pPr>
-      <w:spacing w:before="0" w:after="0"/>
-      <w:jc w:val="left"/>
-    </w:pPr>
-    <w:rPr>
-      <w:rFonts w:ascii="Cambria" w:hAnsi="Cambria" w:eastAsia="Cambria" w:cs="Cambria"/>
-      <w:sz w:val="18"/>
-      <w:szCs w:val="18"/>
-    </w:rPr>
-  </w:style>
-  <w:style w:type="paragraph" w:customStyle="1" w:styleId="CTMarcaPrevia">
-    <w:name w:val="CT Marca de prévia"/>
-    <w:basedOn w:val="Normal"/>
-    <w:next w:val="CTMarcaPrevia"/>
-    <w:qFormat/>
-    <w:pPr>
-      <w:spacing w:before="0" w:after="0"/>
-      <w:jc w:val="center"/>
-    </w:pPr>
-    <w:rPr>
-      <w:rFonts w:ascii="Cambria" w:hAnsi="Cambria" w:eastAsia="Cambria" w:cs="Cambria"/>
-      <w:b/>
-      <w:bCs/>
-      <w:caps/>
-      <w:sz w:val="18"/>
-      <w:szCs w:val="18"/>
-    </w:rPr>
-  </w:style>
-  <w:style w:type="character" w:customStyle="1" w:styleId="CTCabecalhoCaractere">
-    <w:name w:val="CT Cabeçalho caractere"/>
-    <w:basedOn w:val="DefaultParagraphFont"/>
-    <w:rPr>
-      <w:rFonts w:ascii="Cambria" w:hAnsi="Cambria" w:eastAsia="Cambria" w:cs="Cambria"/>
-      <w:sz w:val="18"/>
-      <w:szCs w:val="18"/>
-    </w:rPr>
-  </w:style>
-  <w:style w:type="paragraph" w:customStyle="1" w:styleId="CTAssinaturaLinha">
-    <w:name w:val="CT Linha de assinatura"/>
-    <w:basedOn w:val="CTAssinatura"/>
-    <w:next w:val="CTAssinatura"/>
-    <w:pPr>
-      <w:keepNext/>
-      <w:keepLines/>
-      <w:pBdr>
-        <w:top w:val="single" w:sz="6" w:space="5" w:color="333333"/>
-      </w:pBdr>
-    </w:pPr>
-  </w:style>
-  <w:style w:type="character" w:customStyle="1" w:styleId="CTAssinaturaNome">
-    <w:name w:val="CT Nome da assinatura"/>
-    <w:basedOn w:val="DefaultParagraphFont"/>
-    <w:rPr>
-      <w:rFonts w:ascii="Cambria" w:hAnsi="Cambria" w:eastAsia="Cambria" w:cs="Cambria"/>
-      <w:b/>
-      <w:bCs/>
-      <w:sz w:val="20"/>
-      <w:szCs w:val="20"/>
-    </w:rPr>
-  </w:style>
-  <w:style w:type="character" w:customStyle="1" w:styleId="CTAssinaturaQualificacao">
-    <w:name w:val="CT Qualificação da assinatura"/>
-    <w:basedOn w:val="DefaultParagraphFont"/>
-    <w:rPr>
-      <w:rFonts w:ascii="Cambria" w:hAnsi="Cambria" w:eastAsia="Cambria" w:cs="Cambria"/>
-      <w:sz w:val="18"/>
-      <w:szCs w:val="18"/>
-    </w:rPr>
-  </w:style>
 </w:styles>
 </file>
</xml_diff>